<commit_message>
Add attachments and PDF version of opinion letter
Co-Authored-By: Claude Sonnet 5.5 <noreply@anthropic.com>
Claude-Session: https://claude.ai/code/session_01MdmrBNvqv8LepqLUPjtCN4
</commit_message>
<xml_diff>
--- a/의견서_초안.docx
+++ b/의견서_초안.docx
@@ -672,7 +672,7 @@
           <w:sz w:val="21"/>
           <w:szCs w:val="21"/>
         </w:rPr>
-        <w:t xml:space="preserve">붙임 1. 평가기준(안) 비교표 1부 (필요 시)</w:t>
+        <w:t xml:space="preserve">붙임 1. 평가기준(안) 비교표 1부</w:t>
       </w:r>
     </w:p>
     <w:p>
@@ -685,7 +685,7 @@
           <w:sz w:val="21"/>
           <w:szCs w:val="21"/>
         </w:rPr>
-        <w:t xml:space="preserve">붙임 2. 관련 법령·고시 발췌 1부 (필요 시).  끝.</w:t>
+        <w:t xml:space="preserve">붙임 2. 관련 고시 요지 1부.  끝.</w:t>
       </w:r>
     </w:p>
     <w:p>
@@ -702,6 +702,992 @@
           <w:szCs w:val="23"/>
         </w:rPr>
         <w:t xml:space="preserve">○○○○○○  대표  ○ ○ ○  (인)</w:t>
+      </w:r>
+    </w:p>
+    <w:p>
+      <w:pPr>
+        <w:pageBreakBefore/>
+        <w:spacing w:after="200"/>
+      </w:pPr>
+      <w:r>
+        <w:rPr>
+          <w:rFonts w:ascii="맑은 고딕" w:cs="맑은 고딕" w:eastAsia="맑은 고딕" w:hAnsi="맑은 고딕"/>
+          <w:b/>
+          <w:bCs/>
+          <w:sz w:val="26"/>
+          <w:szCs w:val="26"/>
+        </w:rPr>
+        <w:t xml:space="preserve">붙임 1</w:t>
+      </w:r>
+    </w:p>
+    <w:p>
+      <w:pPr>
+        <w:spacing w:after="160"/>
+      </w:pPr>
+      <w:r>
+        <w:rPr>
+          <w:rFonts w:ascii="맑은 고딕" w:cs="맑은 고딕" w:eastAsia="맑은 고딕" w:hAnsi="맑은 고딕"/>
+          <w:b/>
+          <w:bCs/>
+          <w:sz w:val="23"/>
+          <w:szCs w:val="23"/>
+        </w:rPr>
+        <w:t xml:space="preserve">평가기준(안) 비교표 — 납품실적(최근 5년 이내, 금액: 납품실적/추정가격)</w:t>
+      </w:r>
+    </w:p>
+    <w:tbl>
+      <w:tblPr>
+        <w:tblW w:type="dxa" w:w="9026"/>
+        <w:tblBorders>
+          <w:top w:val="single" w:color="auto" w:sz="4"/>
+          <w:left w:val="single" w:color="auto" w:sz="4"/>
+          <w:bottom w:val="single" w:color="auto" w:sz="4"/>
+          <w:right w:val="single" w:color="auto" w:sz="4"/>
+          <w:insideH w:val="single" w:color="auto" w:sz="4"/>
+          <w:insideV w:val="single" w:color="auto" w:sz="4"/>
+        </w:tblBorders>
+      </w:tblPr>
+      <w:tblGrid>
+        <w:gridCol w:w="1700"/>
+        <w:gridCol w:w="3663"/>
+        <w:gridCol w:w="3663"/>
+      </w:tblGrid>
+      <w:tr>
+        <w:tc>
+          <w:tcPr>
+            <w:tcW w:type="dxa" w:w="1700"/>
+            <w:tcBorders>
+              <w:top w:val="single" w:color="808080" w:sz="4"/>
+              <w:left w:val="single" w:color="808080" w:sz="4"/>
+              <w:bottom w:val="single" w:color="808080" w:sz="4"/>
+              <w:right w:val="single" w:color="808080" w:sz="4"/>
+            </w:tcBorders>
+            <w:shd w:fill="D9E2F3" w:color="auto" w:val="clear"/>
+            <w:tcMar>
+              <w:top w:type="dxa" w:w="70"/>
+              <w:left w:type="dxa" w:w="100"/>
+              <w:bottom w:type="dxa" w:w="70"/>
+              <w:right w:type="dxa" w:w="100"/>
+            </w:tcMar>
+            <w:vAlign w:val="center"/>
+          </w:tcPr>
+          <w:p>
+            <w:pPr>
+              <w:spacing w:after="0"/>
+              <w:jc w:val="center"/>
+            </w:pPr>
+            <w:r>
+              <w:rPr>
+                <w:rFonts w:ascii="맑은 고딕" w:cs="맑은 고딕" w:eastAsia="맑은 고딕" w:hAnsi="맑은 고딕"/>
+                <w:b/>
+                <w:bCs/>
+                <w:sz w:val="20"/>
+                <w:szCs w:val="20"/>
+              </w:rPr>
+              <w:t xml:space="preserve">구분</w:t>
+            </w:r>
+          </w:p>
+        </w:tc>
+        <w:tc>
+          <w:tcPr>
+            <w:tcW w:type="dxa" w:w="3663"/>
+            <w:tcBorders>
+              <w:top w:val="single" w:color="808080" w:sz="4"/>
+              <w:left w:val="single" w:color="808080" w:sz="4"/>
+              <w:bottom w:val="single" w:color="808080" w:sz="4"/>
+              <w:right w:val="single" w:color="808080" w:sz="4"/>
+            </w:tcBorders>
+            <w:shd w:fill="D9E2F3" w:color="auto" w:val="clear"/>
+            <w:tcMar>
+              <w:top w:type="dxa" w:w="70"/>
+              <w:left w:type="dxa" w:w="100"/>
+              <w:bottom w:type="dxa" w:w="70"/>
+              <w:right w:type="dxa" w:w="100"/>
+            </w:tcMar>
+            <w:vAlign w:val="center"/>
+          </w:tcPr>
+          <w:p>
+            <w:pPr>
+              <w:spacing w:after="0"/>
+              <w:jc w:val="center"/>
+            </w:pPr>
+            <w:r>
+              <w:rPr>
+                <w:rFonts w:ascii="맑은 고딕" w:cs="맑은 고딕" w:eastAsia="맑은 고딕" w:hAnsi="맑은 고딕"/>
+                <w:b/>
+                <w:bCs/>
+                <w:sz w:val="20"/>
+                <w:szCs w:val="20"/>
+              </w:rPr>
+              <w:t xml:space="preserve">1안 (요청)</w:t>
+            </w:r>
+          </w:p>
+        </w:tc>
+        <w:tc>
+          <w:tcPr>
+            <w:tcW w:type="dxa" w:w="3663"/>
+            <w:tcBorders>
+              <w:top w:val="single" w:color="808080" w:sz="4"/>
+              <w:left w:val="single" w:color="808080" w:sz="4"/>
+              <w:bottom w:val="single" w:color="808080" w:sz="4"/>
+              <w:right w:val="single" w:color="808080" w:sz="4"/>
+            </w:tcBorders>
+            <w:shd w:fill="D9E2F3" w:color="auto" w:val="clear"/>
+            <w:tcMar>
+              <w:top w:type="dxa" w:w="70"/>
+              <w:left w:type="dxa" w:w="100"/>
+              <w:bottom w:type="dxa" w:w="70"/>
+              <w:right w:type="dxa" w:w="100"/>
+            </w:tcMar>
+            <w:vAlign w:val="center"/>
+          </w:tcPr>
+          <w:p>
+            <w:pPr>
+              <w:spacing w:after="0"/>
+              <w:jc w:val="center"/>
+            </w:pPr>
+            <w:r>
+              <w:rPr>
+                <w:rFonts w:ascii="맑은 고딕" w:cs="맑은 고딕" w:eastAsia="맑은 고딕" w:hAnsi="맑은 고딕"/>
+                <w:b/>
+                <w:bCs/>
+                <w:sz w:val="20"/>
+                <w:szCs w:val="20"/>
+              </w:rPr>
+              <w:t xml:space="preserve">2안</w:t>
+            </w:r>
+          </w:p>
+        </w:tc>
+      </w:tr>
+      <w:tr>
+        <w:tc>
+          <w:tcPr>
+            <w:tcW w:type="dxa" w:w="1700"/>
+            <w:tcBorders>
+              <w:top w:val="single" w:color="808080" w:sz="4"/>
+              <w:left w:val="single" w:color="808080" w:sz="4"/>
+              <w:bottom w:val="single" w:color="808080" w:sz="4"/>
+              <w:right w:val="single" w:color="808080" w:sz="4"/>
+            </w:tcBorders>
+            <w:tcMar>
+              <w:top w:type="dxa" w:w="70"/>
+              <w:left w:type="dxa" w:w="100"/>
+              <w:bottom w:type="dxa" w:w="70"/>
+              <w:right w:type="dxa" w:w="100"/>
+            </w:tcMar>
+            <w:vAlign w:val="center"/>
+          </w:tcPr>
+          <w:p>
+            <w:pPr>
+              <w:spacing w:after="0"/>
+              <w:jc w:val="center"/>
+            </w:pPr>
+            <w:r>
+              <w:rPr>
+                <w:rFonts w:ascii="맑은 고딕" w:cs="맑은 고딕" w:eastAsia="맑은 고딕" w:hAnsi="맑은 고딕"/>
+                <w:b w:val="false"/>
+                <w:bCs w:val="false"/>
+                <w:sz w:val="20"/>
+                <w:szCs w:val="20"/>
+              </w:rPr>
+              <w:t xml:space="preserve">동등이상 물품 (5.0점)</w:t>
+            </w:r>
+          </w:p>
+        </w:tc>
+        <w:tc>
+          <w:tcPr>
+            <w:tcW w:type="dxa" w:w="3663"/>
+            <w:tcBorders>
+              <w:top w:val="single" w:color="808080" w:sz="4"/>
+              <w:left w:val="single" w:color="808080" w:sz="4"/>
+              <w:bottom w:val="single" w:color="808080" w:sz="4"/>
+              <w:right w:val="single" w:color="808080" w:sz="4"/>
+            </w:tcBorders>
+            <w:tcMar>
+              <w:top w:type="dxa" w:w="70"/>
+              <w:left w:type="dxa" w:w="100"/>
+              <w:bottom w:type="dxa" w:w="70"/>
+              <w:right w:type="dxa" w:w="100"/>
+            </w:tcMar>
+            <w:vAlign w:val="center"/>
+          </w:tcPr>
+          <w:p>
+            <w:pPr>
+              <w:spacing w:after="0"/>
+              <w:jc w:val="left"/>
+            </w:pPr>
+            <w:r>
+              <w:rPr>
+                <w:rFonts w:ascii="맑은 고딕" w:cs="맑은 고딕" w:eastAsia="맑은 고딕" w:hAnsi="맑은 고딕"/>
+                <w:b w:val="false"/>
+                <w:bCs w:val="false"/>
+                <w:sz w:val="20"/>
+                <w:szCs w:val="20"/>
+              </w:rPr>
+              <w:t xml:space="preserve">대당 개폐용량 70톤 이상이며, 와이어로프식 수문권양기</w:t>
+            </w:r>
+          </w:p>
+        </w:tc>
+        <w:tc>
+          <w:tcPr>
+            <w:tcW w:type="dxa" w:w="3663"/>
+            <w:tcBorders>
+              <w:top w:val="single" w:color="808080" w:sz="4"/>
+              <w:left w:val="single" w:color="808080" w:sz="4"/>
+              <w:bottom w:val="single" w:color="808080" w:sz="4"/>
+              <w:right w:val="single" w:color="808080" w:sz="4"/>
+            </w:tcBorders>
+            <w:tcMar>
+              <w:top w:type="dxa" w:w="70"/>
+              <w:left w:type="dxa" w:w="100"/>
+              <w:bottom w:type="dxa" w:w="70"/>
+              <w:right w:type="dxa" w:w="100"/>
+            </w:tcMar>
+            <w:vAlign w:val="center"/>
+          </w:tcPr>
+          <w:p>
+            <w:pPr>
+              <w:spacing w:after="0"/>
+              <w:jc w:val="left"/>
+            </w:pPr>
+            <w:r>
+              <w:rPr>
+                <w:rFonts w:ascii="맑은 고딕" w:cs="맑은 고딕" w:eastAsia="맑은 고딕" w:hAnsi="맑은 고딕"/>
+                <w:b w:val="false"/>
+                <w:bCs w:val="false"/>
+                <w:sz w:val="20"/>
+                <w:szCs w:val="20"/>
+              </w:rPr>
+              <w:t xml:space="preserve">와이어로프식 수문권양기</w:t>
+            </w:r>
+          </w:p>
+        </w:tc>
+      </w:tr>
+      <w:tr>
+        <w:tc>
+          <w:tcPr>
+            <w:tcW w:type="dxa" w:w="1700"/>
+            <w:tcBorders>
+              <w:top w:val="single" w:color="808080" w:sz="4"/>
+              <w:left w:val="single" w:color="808080" w:sz="4"/>
+              <w:bottom w:val="single" w:color="808080" w:sz="4"/>
+              <w:right w:val="single" w:color="808080" w:sz="4"/>
+            </w:tcBorders>
+            <w:tcMar>
+              <w:top w:type="dxa" w:w="70"/>
+              <w:left w:type="dxa" w:w="100"/>
+              <w:bottom w:type="dxa" w:w="70"/>
+              <w:right w:type="dxa" w:w="100"/>
+            </w:tcMar>
+            <w:vAlign w:val="center"/>
+          </w:tcPr>
+          <w:p>
+            <w:pPr>
+              <w:spacing w:after="0"/>
+              <w:jc w:val="center"/>
+            </w:pPr>
+            <w:r>
+              <w:rPr>
+                <w:rFonts w:ascii="맑은 고딕" w:cs="맑은 고딕" w:eastAsia="맑은 고딕" w:hAnsi="맑은 고딕"/>
+                <w:b w:val="false"/>
+                <w:bCs w:val="false"/>
+                <w:sz w:val="20"/>
+                <w:szCs w:val="20"/>
+              </w:rPr>
+              <w:t xml:space="preserve">유사물품 (1.5점)</w:t>
+            </w:r>
+          </w:p>
+        </w:tc>
+        <w:tc>
+          <w:tcPr>
+            <w:tcW w:type="dxa" w:w="3663"/>
+            <w:tcBorders>
+              <w:top w:val="single" w:color="808080" w:sz="4"/>
+              <w:left w:val="single" w:color="808080" w:sz="4"/>
+              <w:bottom w:val="single" w:color="808080" w:sz="4"/>
+              <w:right w:val="single" w:color="808080" w:sz="4"/>
+            </w:tcBorders>
+            <w:tcMar>
+              <w:top w:type="dxa" w:w="70"/>
+              <w:left w:type="dxa" w:w="100"/>
+              <w:bottom w:type="dxa" w:w="70"/>
+              <w:right w:type="dxa" w:w="100"/>
+            </w:tcMar>
+            <w:vAlign w:val="center"/>
+          </w:tcPr>
+          <w:p>
+            <w:pPr>
+              <w:spacing w:after="0"/>
+              <w:jc w:val="left"/>
+            </w:pPr>
+            <w:r>
+              <w:rPr>
+                <w:rFonts w:ascii="맑은 고딕" w:cs="맑은 고딕" w:eastAsia="맑은 고딕" w:hAnsi="맑은 고딕"/>
+                <w:b w:val="false"/>
+                <w:bCs w:val="false"/>
+                <w:sz w:val="20"/>
+                <w:szCs w:val="20"/>
+              </w:rPr>
+              <w:t xml:space="preserve">대당 개폐용량 70톤 미만인 수문권양기(와이어로프식, 유압식, 랙피니언식 등)</w:t>
+            </w:r>
+          </w:p>
+        </w:tc>
+        <w:tc>
+          <w:tcPr>
+            <w:tcW w:type="dxa" w:w="3663"/>
+            <w:tcBorders>
+              <w:top w:val="single" w:color="808080" w:sz="4"/>
+              <w:left w:val="single" w:color="808080" w:sz="4"/>
+              <w:bottom w:val="single" w:color="808080" w:sz="4"/>
+              <w:right w:val="single" w:color="808080" w:sz="4"/>
+            </w:tcBorders>
+            <w:tcMar>
+              <w:top w:type="dxa" w:w="70"/>
+              <w:left w:type="dxa" w:w="100"/>
+              <w:bottom w:type="dxa" w:w="70"/>
+              <w:right w:type="dxa" w:w="100"/>
+            </w:tcMar>
+            <w:vAlign w:val="center"/>
+          </w:tcPr>
+          <w:p>
+            <w:pPr>
+              <w:spacing w:after="0"/>
+              <w:jc w:val="left"/>
+            </w:pPr>
+            <w:r>
+              <w:rPr>
+                <w:rFonts w:ascii="맑은 고딕" w:cs="맑은 고딕" w:eastAsia="맑은 고딕" w:hAnsi="맑은 고딕"/>
+                <w:b w:val="false"/>
+                <w:bCs w:val="false"/>
+                <w:sz w:val="20"/>
+                <w:szCs w:val="20"/>
+              </w:rPr>
+              <w:t xml:space="preserve">수문권양기(유압식, 랙피니언식 등)</w:t>
+            </w:r>
+          </w:p>
+        </w:tc>
+      </w:tr>
+      <w:tr>
+        <w:tc>
+          <w:tcPr>
+            <w:tcW w:type="dxa" w:w="1700"/>
+            <w:tcBorders>
+              <w:top w:val="single" w:color="808080" w:sz="4"/>
+              <w:left w:val="single" w:color="808080" w:sz="4"/>
+              <w:bottom w:val="single" w:color="808080" w:sz="4"/>
+              <w:right w:val="single" w:color="808080" w:sz="4"/>
+            </w:tcBorders>
+            <w:tcMar>
+              <w:top w:type="dxa" w:w="70"/>
+              <w:left w:type="dxa" w:w="100"/>
+              <w:bottom w:type="dxa" w:w="70"/>
+              <w:right w:type="dxa" w:w="100"/>
+            </w:tcMar>
+            <w:vAlign w:val="center"/>
+          </w:tcPr>
+          <w:p>
+            <w:pPr>
+              <w:spacing w:after="0"/>
+              <w:jc w:val="center"/>
+            </w:pPr>
+            <w:r>
+              <w:rPr>
+                <w:rFonts w:ascii="맑은 고딕" w:cs="맑은 고딕" w:eastAsia="맑은 고딕" w:hAnsi="맑은 고딕"/>
+                <w:b w:val="false"/>
+                <w:bCs w:val="false"/>
+                <w:sz w:val="20"/>
+                <w:szCs w:val="20"/>
+              </w:rPr>
+              <w:t xml:space="preserve">고시 [별표 1] 주석과의 부합</w:t>
+            </w:r>
+          </w:p>
+        </w:tc>
+        <w:tc>
+          <w:tcPr>
+            <w:tcW w:type="dxa" w:w="3663"/>
+            <w:tcBorders>
+              <w:top w:val="single" w:color="808080" w:sz="4"/>
+              <w:left w:val="single" w:color="808080" w:sz="4"/>
+              <w:bottom w:val="single" w:color="808080" w:sz="4"/>
+              <w:right w:val="single" w:color="808080" w:sz="4"/>
+            </w:tcBorders>
+            <w:tcMar>
+              <w:top w:type="dxa" w:w="70"/>
+              <w:left w:type="dxa" w:w="100"/>
+              <w:bottom w:type="dxa" w:w="70"/>
+              <w:right w:type="dxa" w:w="100"/>
+            </w:tcMar>
+            <w:vAlign w:val="center"/>
+          </w:tcPr>
+          <w:p>
+            <w:pPr>
+              <w:spacing w:after="0"/>
+              <w:jc w:val="left"/>
+            </w:pPr>
+            <w:r>
+              <w:rPr>
+                <w:rFonts w:ascii="맑은 고딕" w:cs="맑은 고딕" w:eastAsia="맑은 고딕" w:hAnsi="맑은 고딕"/>
+                <w:b w:val="false"/>
+                <w:bCs w:val="false"/>
+                <w:sz w:val="20"/>
+                <w:szCs w:val="20"/>
+              </w:rPr>
+              <w:t xml:space="preserve">동등이상을 입찰대상 규모(70톤 이상) 이상으로 한정하여 "성능·품질이 입찰대상 이상"이라는 정의에 부합. 동일 종류의 소규모 실적은 유사물품으로 평가</w:t>
+            </w:r>
+          </w:p>
+        </w:tc>
+        <w:tc>
+          <w:tcPr>
+            <w:tcW w:type="dxa" w:w="3663"/>
+            <w:tcBorders>
+              <w:top w:val="single" w:color="808080" w:sz="4"/>
+              <w:left w:val="single" w:color="808080" w:sz="4"/>
+              <w:bottom w:val="single" w:color="808080" w:sz="4"/>
+              <w:right w:val="single" w:color="808080" w:sz="4"/>
+            </w:tcBorders>
+            <w:tcMar>
+              <w:top w:type="dxa" w:w="70"/>
+              <w:left w:type="dxa" w:w="100"/>
+              <w:bottom w:type="dxa" w:w="70"/>
+              <w:right w:type="dxa" w:w="100"/>
+            </w:tcMar>
+            <w:vAlign w:val="center"/>
+          </w:tcPr>
+          <w:p>
+            <w:pPr>
+              <w:spacing w:after="0"/>
+              <w:jc w:val="left"/>
+            </w:pPr>
+            <w:r>
+              <w:rPr>
+                <w:rFonts w:ascii="맑은 고딕" w:cs="맑은 고딕" w:eastAsia="맑은 고딕" w:hAnsi="맑은 고딕"/>
+                <w:b w:val="false"/>
+                <w:bCs w:val="false"/>
+                <w:sz w:val="20"/>
+                <w:szCs w:val="20"/>
+              </w:rPr>
+              <w:t xml:space="preserve">규모 기준이 없어 입찰대상보다 작은 와이어로프식도 동등이상으로 평가되어 "입찰대상 이상" 정의와 맞지 않을 소지</w:t>
+            </w:r>
+          </w:p>
+        </w:tc>
+      </w:tr>
+      <w:tr>
+        <w:tc>
+          <w:tcPr>
+            <w:tcW w:type="dxa" w:w="1700"/>
+            <w:tcBorders>
+              <w:top w:val="single" w:color="808080" w:sz="4"/>
+              <w:left w:val="single" w:color="808080" w:sz="4"/>
+              <w:bottom w:val="single" w:color="808080" w:sz="4"/>
+              <w:right w:val="single" w:color="808080" w:sz="4"/>
+            </w:tcBorders>
+            <w:tcMar>
+              <w:top w:type="dxa" w:w="70"/>
+              <w:left w:type="dxa" w:w="100"/>
+              <w:bottom w:type="dxa" w:w="70"/>
+              <w:right w:type="dxa" w:w="100"/>
+            </w:tcMar>
+            <w:vAlign w:val="center"/>
+          </w:tcPr>
+          <w:p>
+            <w:pPr>
+              <w:spacing w:after="0"/>
+              <w:jc w:val="center"/>
+            </w:pPr>
+            <w:r>
+              <w:rPr>
+                <w:rFonts w:ascii="맑은 고딕" w:cs="맑은 고딕" w:eastAsia="맑은 고딕" w:hAnsi="맑은 고딕"/>
+                <w:b w:val="false"/>
+                <w:bCs w:val="false"/>
+                <w:sz w:val="20"/>
+                <w:szCs w:val="20"/>
+              </w:rPr>
+              <w:t xml:space="preserve">평가의 명확성</w:t>
+            </w:r>
+          </w:p>
+        </w:tc>
+        <w:tc>
+          <w:tcPr>
+            <w:tcW w:type="dxa" w:w="3663"/>
+            <w:tcBorders>
+              <w:top w:val="single" w:color="808080" w:sz="4"/>
+              <w:left w:val="single" w:color="808080" w:sz="4"/>
+              <w:bottom w:val="single" w:color="808080" w:sz="4"/>
+              <w:right w:val="single" w:color="808080" w:sz="4"/>
+            </w:tcBorders>
+            <w:tcMar>
+              <w:top w:type="dxa" w:w="70"/>
+              <w:left w:type="dxa" w:w="100"/>
+              <w:bottom w:type="dxa" w:w="70"/>
+              <w:right w:type="dxa" w:w="100"/>
+            </w:tcMar>
+            <w:vAlign w:val="center"/>
+          </w:tcPr>
+          <w:p>
+            <w:pPr>
+              <w:spacing w:after="0"/>
+              <w:jc w:val="left"/>
+            </w:pPr>
+            <w:r>
+              <w:rPr>
+                <w:rFonts w:ascii="맑은 고딕" w:cs="맑은 고딕" w:eastAsia="맑은 고딕" w:hAnsi="맑은 고딕"/>
+                <w:b w:val="false"/>
+                <w:bCs w:val="false"/>
+                <w:sz w:val="20"/>
+                <w:szCs w:val="20"/>
+              </w:rPr>
+              <w:t xml:space="preserve">규모·형식 기준이 모두 명시되어 평가 시 해석 여지가 적음</w:t>
+            </w:r>
+          </w:p>
+        </w:tc>
+        <w:tc>
+          <w:tcPr>
+            <w:tcW w:type="dxa" w:w="3663"/>
+            <w:tcBorders>
+              <w:top w:val="single" w:color="808080" w:sz="4"/>
+              <w:left w:val="single" w:color="808080" w:sz="4"/>
+              <w:bottom w:val="single" w:color="808080" w:sz="4"/>
+              <w:right w:val="single" w:color="808080" w:sz="4"/>
+            </w:tcBorders>
+            <w:tcMar>
+              <w:top w:type="dxa" w:w="70"/>
+              <w:left w:type="dxa" w:w="100"/>
+              <w:bottom w:type="dxa" w:w="70"/>
+              <w:right w:type="dxa" w:w="100"/>
+            </w:tcMar>
+            <w:vAlign w:val="center"/>
+          </w:tcPr>
+          <w:p>
+            <w:pPr>
+              <w:spacing w:after="0"/>
+              <w:jc w:val="left"/>
+            </w:pPr>
+            <w:r>
+              <w:rPr>
+                <w:rFonts w:ascii="맑은 고딕" w:cs="맑은 고딕" w:eastAsia="맑은 고딕" w:hAnsi="맑은 고딕"/>
+                <w:b w:val="false"/>
+                <w:bCs w:val="false"/>
+                <w:sz w:val="20"/>
+                <w:szCs w:val="20"/>
+              </w:rPr>
+              <w:t xml:space="preserve">규모 기준이 없어 동등이상 해당 범위가 넓고, 변별력이 낮아질 수 있음</w:t>
+            </w:r>
+          </w:p>
+        </w:tc>
+      </w:tr>
+    </w:tbl>
+    <w:p>
+      <w:pPr>
+        <w:pageBreakBefore/>
+        <w:spacing w:after="200"/>
+      </w:pPr>
+      <w:r>
+        <w:rPr>
+          <w:rFonts w:ascii="맑은 고딕" w:cs="맑은 고딕" w:eastAsia="맑은 고딕" w:hAnsi="맑은 고딕"/>
+          <w:b/>
+          <w:bCs/>
+          <w:sz w:val="26"/>
+          <w:szCs w:val="26"/>
+        </w:rPr>
+        <w:t xml:space="preserve">붙임 2</w:t>
+      </w:r>
+    </w:p>
+    <w:p>
+      <w:pPr>
+        <w:spacing w:after="160"/>
+      </w:pPr>
+      <w:r>
+        <w:rPr>
+          <w:rFonts w:ascii="맑은 고딕" w:cs="맑은 고딕" w:eastAsia="맑은 고딕" w:hAnsi="맑은 고딕"/>
+          <w:b/>
+          <w:bCs/>
+          <w:sz w:val="23"/>
+          <w:szCs w:val="23"/>
+        </w:rPr>
+        <w:t xml:space="preserve">관련 고시 요지</w:t>
+      </w:r>
+    </w:p>
+    <w:tbl>
+      <w:tblPr>
+        <w:tblW w:type="dxa" w:w="9026"/>
+        <w:tblBorders>
+          <w:top w:val="single" w:color="auto" w:sz="4"/>
+          <w:left w:val="single" w:color="auto" w:sz="4"/>
+          <w:bottom w:val="single" w:color="auto" w:sz="4"/>
+          <w:right w:val="single" w:color="auto" w:sz="4"/>
+          <w:insideH w:val="single" w:color="auto" w:sz="4"/>
+          <w:insideV w:val="single" w:color="auto" w:sz="4"/>
+        </w:tblBorders>
+      </w:tblPr>
+      <w:tblGrid>
+        <w:gridCol w:w="2300"/>
+        <w:gridCol w:w="6726"/>
+      </w:tblGrid>
+      <w:tr>
+        <w:tc>
+          <w:tcPr>
+            <w:tcW w:type="dxa" w:w="2300"/>
+            <w:tcBorders>
+              <w:top w:val="single" w:color="808080" w:sz="4"/>
+              <w:left w:val="single" w:color="808080" w:sz="4"/>
+              <w:bottom w:val="single" w:color="808080" w:sz="4"/>
+              <w:right w:val="single" w:color="808080" w:sz="4"/>
+            </w:tcBorders>
+            <w:shd w:fill="D9E2F3" w:color="auto" w:val="clear"/>
+            <w:tcMar>
+              <w:top w:type="dxa" w:w="70"/>
+              <w:left w:type="dxa" w:w="100"/>
+              <w:bottom w:type="dxa" w:w="70"/>
+              <w:right w:type="dxa" w:w="100"/>
+            </w:tcMar>
+            <w:vAlign w:val="center"/>
+          </w:tcPr>
+          <w:p>
+            <w:pPr>
+              <w:spacing w:after="0"/>
+              <w:jc w:val="center"/>
+            </w:pPr>
+            <w:r>
+              <w:rPr>
+                <w:rFonts w:ascii="맑은 고딕" w:cs="맑은 고딕" w:eastAsia="맑은 고딕" w:hAnsi="맑은 고딕"/>
+                <w:b/>
+                <w:bCs/>
+                <w:sz w:val="20"/>
+                <w:szCs w:val="20"/>
+              </w:rPr>
+              <w:t xml:space="preserve">근거</w:t>
+            </w:r>
+          </w:p>
+        </w:tc>
+        <w:tc>
+          <w:tcPr>
+            <w:tcW w:type="dxa" w:w="6726"/>
+            <w:tcBorders>
+              <w:top w:val="single" w:color="808080" w:sz="4"/>
+              <w:left w:val="single" w:color="808080" w:sz="4"/>
+              <w:bottom w:val="single" w:color="808080" w:sz="4"/>
+              <w:right w:val="single" w:color="808080" w:sz="4"/>
+            </w:tcBorders>
+            <w:shd w:fill="D9E2F3" w:color="auto" w:val="clear"/>
+            <w:tcMar>
+              <w:top w:type="dxa" w:w="70"/>
+              <w:left w:type="dxa" w:w="100"/>
+              <w:bottom w:type="dxa" w:w="70"/>
+              <w:right w:type="dxa" w:w="100"/>
+            </w:tcMar>
+            <w:vAlign w:val="center"/>
+          </w:tcPr>
+          <w:p>
+            <w:pPr>
+              <w:spacing w:after="0"/>
+              <w:jc w:val="center"/>
+            </w:pPr>
+            <w:r>
+              <w:rPr>
+                <w:rFonts w:ascii="맑은 고딕" w:cs="맑은 고딕" w:eastAsia="맑은 고딕" w:hAnsi="맑은 고딕"/>
+                <w:b/>
+                <w:bCs/>
+                <w:sz w:val="20"/>
+                <w:szCs w:val="20"/>
+              </w:rPr>
+              <w:t xml:space="preserve">요지</w:t>
+            </w:r>
+          </w:p>
+        </w:tc>
+      </w:tr>
+      <w:tr>
+        <w:tc>
+          <w:tcPr>
+            <w:tcW w:type="dxa" w:w="2300"/>
+            <w:tcBorders>
+              <w:top w:val="single" w:color="808080" w:sz="4"/>
+              <w:left w:val="single" w:color="808080" w:sz="4"/>
+              <w:bottom w:val="single" w:color="808080" w:sz="4"/>
+              <w:right w:val="single" w:color="808080" w:sz="4"/>
+            </w:tcBorders>
+            <w:tcMar>
+              <w:top w:type="dxa" w:w="70"/>
+              <w:left w:type="dxa" w:w="100"/>
+              <w:bottom w:type="dxa" w:w="70"/>
+              <w:right w:type="dxa" w:w="100"/>
+            </w:tcMar>
+            <w:vAlign w:val="center"/>
+          </w:tcPr>
+          <w:p>
+            <w:pPr>
+              <w:spacing w:after="0"/>
+              <w:jc w:val="center"/>
+            </w:pPr>
+            <w:r>
+              <w:rPr>
+                <w:rFonts w:ascii="맑은 고딕" w:cs="맑은 고딕" w:eastAsia="맑은 고딕" w:hAnsi="맑은 고딕"/>
+                <w:b w:val="false"/>
+                <w:bCs w:val="false"/>
+                <w:sz w:val="20"/>
+                <w:szCs w:val="20"/>
+              </w:rPr>
+              <w:t xml:space="preserve">중소벤처기업부고시 제2026-80호 제6조제1항제1호 나목</w:t>
+            </w:r>
+          </w:p>
+        </w:tc>
+        <w:tc>
+          <w:tcPr>
+            <w:tcW w:type="dxa" w:w="6726"/>
+            <w:tcBorders>
+              <w:top w:val="single" w:color="808080" w:sz="4"/>
+              <w:left w:val="single" w:color="808080" w:sz="4"/>
+              <w:bottom w:val="single" w:color="808080" w:sz="4"/>
+              <w:right w:val="single" w:color="808080" w:sz="4"/>
+            </w:tcBorders>
+            <w:tcMar>
+              <w:top w:type="dxa" w:w="70"/>
+              <w:left w:type="dxa" w:w="100"/>
+              <w:bottom w:type="dxa" w:w="70"/>
+              <w:right w:type="dxa" w:w="100"/>
+            </w:tcMar>
+            <w:vAlign w:val="center"/>
+          </w:tcPr>
+          <w:p>
+            <w:pPr>
+              <w:spacing w:after="0"/>
+              <w:jc w:val="left"/>
+            </w:pPr>
+            <w:r>
+              <w:rPr>
+                <w:rFonts w:ascii="맑은 고딕" w:cs="맑은 고딕" w:eastAsia="맑은 고딕" w:hAnsi="맑은 고딕"/>
+                <w:b w:val="false"/>
+                <w:bCs w:val="false"/>
+                <w:sz w:val="20"/>
+                <w:szCs w:val="20"/>
+              </w:rPr>
+              <w:t xml:space="preserve">납품실적은 최근 5년 기준이며, 입찰공고에 명시한 경우 조정하여 적용할 수 있음</w:t>
+            </w:r>
+          </w:p>
+        </w:tc>
+      </w:tr>
+      <w:tr>
+        <w:tc>
+          <w:tcPr>
+            <w:tcW w:type="dxa" w:w="2300"/>
+            <w:tcBorders>
+              <w:top w:val="single" w:color="808080" w:sz="4"/>
+              <w:left w:val="single" w:color="808080" w:sz="4"/>
+              <w:bottom w:val="single" w:color="808080" w:sz="4"/>
+              <w:right w:val="single" w:color="808080" w:sz="4"/>
+            </w:tcBorders>
+            <w:tcMar>
+              <w:top w:type="dxa" w:w="70"/>
+              <w:left w:type="dxa" w:w="100"/>
+              <w:bottom w:type="dxa" w:w="70"/>
+              <w:right w:type="dxa" w:w="100"/>
+            </w:tcMar>
+            <w:vAlign w:val="center"/>
+          </w:tcPr>
+          <w:p>
+            <w:pPr>
+              <w:spacing w:after="0"/>
+              <w:jc w:val="center"/>
+            </w:pPr>
+            <w:r>
+              <w:rPr>
+                <w:rFonts w:ascii="맑은 고딕" w:cs="맑은 고딕" w:eastAsia="맑은 고딕" w:hAnsi="맑은 고딕"/>
+                <w:b w:val="false"/>
+                <w:bCs w:val="false"/>
+                <w:sz w:val="20"/>
+                <w:szCs w:val="20"/>
+              </w:rPr>
+              <w:t xml:space="preserve">같은 고시 제6조제2항제1호 가목</w:t>
+            </w:r>
+          </w:p>
+        </w:tc>
+        <w:tc>
+          <w:tcPr>
+            <w:tcW w:type="dxa" w:w="6726"/>
+            <w:tcBorders>
+              <w:top w:val="single" w:color="808080" w:sz="4"/>
+              <w:left w:val="single" w:color="808080" w:sz="4"/>
+              <w:bottom w:val="single" w:color="808080" w:sz="4"/>
+              <w:right w:val="single" w:color="808080" w:sz="4"/>
+            </w:tcBorders>
+            <w:tcMar>
+              <w:top w:type="dxa" w:w="70"/>
+              <w:left w:type="dxa" w:w="100"/>
+              <w:bottom w:type="dxa" w:w="70"/>
+              <w:right w:type="dxa" w:w="100"/>
+            </w:tcMar>
+            <w:vAlign w:val="center"/>
+          </w:tcPr>
+          <w:p>
+            <w:pPr>
+              <w:spacing w:after="0"/>
+              <w:jc w:val="left"/>
+            </w:pPr>
+            <w:r>
+              <w:rPr>
+                <w:rFonts w:ascii="맑은 고딕" w:cs="맑은 고딕" w:eastAsia="맑은 고딕" w:hAnsi="맑은 고딕"/>
+                <w:b w:val="false"/>
+                <w:bCs w:val="false"/>
+                <w:sz w:val="20"/>
+                <w:szCs w:val="20"/>
+              </w:rPr>
+              <w:t xml:space="preserve">납품실적 평가의 동등이상 물품·유사물품의 평가기준은 계약담당자가 공고에 명시</w:t>
+            </w:r>
+          </w:p>
+        </w:tc>
+      </w:tr>
+      <w:tr>
+        <w:tc>
+          <w:tcPr>
+            <w:tcW w:type="dxa" w:w="2300"/>
+            <w:tcBorders>
+              <w:top w:val="single" w:color="808080" w:sz="4"/>
+              <w:left w:val="single" w:color="808080" w:sz="4"/>
+              <w:bottom w:val="single" w:color="808080" w:sz="4"/>
+              <w:right w:val="single" w:color="808080" w:sz="4"/>
+            </w:tcBorders>
+            <w:tcMar>
+              <w:top w:type="dxa" w:w="70"/>
+              <w:left w:type="dxa" w:w="100"/>
+              <w:bottom w:type="dxa" w:w="70"/>
+              <w:right w:type="dxa" w:w="100"/>
+            </w:tcMar>
+            <w:vAlign w:val="center"/>
+          </w:tcPr>
+          <w:p>
+            <w:pPr>
+              <w:spacing w:after="0"/>
+              <w:jc w:val="center"/>
+            </w:pPr>
+            <w:r>
+              <w:rPr>
+                <w:rFonts w:ascii="맑은 고딕" w:cs="맑은 고딕" w:eastAsia="맑은 고딕" w:hAnsi="맑은 고딕"/>
+                <w:b w:val="false"/>
+                <w:bCs w:val="false"/>
+                <w:sz w:val="20"/>
+                <w:szCs w:val="20"/>
+              </w:rPr>
+              <w:t xml:space="preserve">같은 고시 [별표 1] 주석</w:t>
+            </w:r>
+          </w:p>
+        </w:tc>
+        <w:tc>
+          <w:tcPr>
+            <w:tcW w:type="dxa" w:w="6726"/>
+            <w:tcBorders>
+              <w:top w:val="single" w:color="808080" w:sz="4"/>
+              <w:left w:val="single" w:color="808080" w:sz="4"/>
+              <w:bottom w:val="single" w:color="808080" w:sz="4"/>
+              <w:right w:val="single" w:color="808080" w:sz="4"/>
+            </w:tcBorders>
+            <w:tcMar>
+              <w:top w:type="dxa" w:w="70"/>
+              <w:left w:type="dxa" w:w="100"/>
+              <w:bottom w:type="dxa" w:w="70"/>
+              <w:right w:type="dxa" w:w="100"/>
+            </w:tcMar>
+            <w:vAlign w:val="center"/>
+          </w:tcPr>
+          <w:p>
+            <w:pPr>
+              <w:spacing w:after="0"/>
+              <w:jc w:val="left"/>
+            </w:pPr>
+            <w:r>
+              <w:rPr>
+                <w:rFonts w:ascii="맑은 고딕" w:cs="맑은 고딕" w:eastAsia="맑은 고딕" w:hAnsi="맑은 고딕"/>
+                <w:b w:val="false"/>
+                <w:bCs w:val="false"/>
+                <w:sz w:val="20"/>
+                <w:szCs w:val="20"/>
+              </w:rPr>
+              <w:t xml:space="preserve">동등이상 물품은 성능·품질이 입찰대상 물품 이상인 것, 유사물품은 동일 종류로서 성능·품질이 동등 미만인 것</w:t>
+            </w:r>
+          </w:p>
+        </w:tc>
+      </w:tr>
+      <w:tr>
+        <w:tc>
+          <w:tcPr>
+            <w:tcW w:type="dxa" w:w="2300"/>
+            <w:tcBorders>
+              <w:top w:val="single" w:color="808080" w:sz="4"/>
+              <w:left w:val="single" w:color="808080" w:sz="4"/>
+              <w:bottom w:val="single" w:color="808080" w:sz="4"/>
+              <w:right w:val="single" w:color="808080" w:sz="4"/>
+            </w:tcBorders>
+            <w:tcMar>
+              <w:top w:type="dxa" w:w="70"/>
+              <w:left w:type="dxa" w:w="100"/>
+              <w:bottom w:type="dxa" w:w="70"/>
+              <w:right w:type="dxa" w:w="100"/>
+            </w:tcMar>
+            <w:vAlign w:val="center"/>
+          </w:tcPr>
+          <w:p>
+            <w:pPr>
+              <w:spacing w:after="0"/>
+              <w:jc w:val="center"/>
+            </w:pPr>
+            <w:r>
+              <w:rPr>
+                <w:rFonts w:ascii="맑은 고딕" w:cs="맑은 고딕" w:eastAsia="맑은 고딕" w:hAnsi="맑은 고딕"/>
+                <w:b w:val="false"/>
+                <w:bCs w:val="false"/>
+                <w:sz w:val="20"/>
+                <w:szCs w:val="20"/>
+              </w:rPr>
+              <w:t xml:space="preserve">같은 고시 [별표 1] 배점</w:t>
+            </w:r>
+          </w:p>
+        </w:tc>
+        <w:tc>
+          <w:tcPr>
+            <w:tcW w:type="dxa" w:w="6726"/>
+            <w:tcBorders>
+              <w:top w:val="single" w:color="808080" w:sz="4"/>
+              <w:left w:val="single" w:color="808080" w:sz="4"/>
+              <w:bottom w:val="single" w:color="808080" w:sz="4"/>
+              <w:right w:val="single" w:color="808080" w:sz="4"/>
+            </w:tcBorders>
+            <w:tcMar>
+              <w:top w:type="dxa" w:w="70"/>
+              <w:left w:type="dxa" w:w="100"/>
+              <w:bottom w:type="dxa" w:w="70"/>
+              <w:right w:type="dxa" w:w="100"/>
+            </w:tcMar>
+            <w:vAlign w:val="center"/>
+          </w:tcPr>
+          <w:p>
+            <w:pPr>
+              <w:spacing w:after="0"/>
+              <w:jc w:val="left"/>
+            </w:pPr>
+            <w:r>
+              <w:rPr>
+                <w:rFonts w:ascii="맑은 고딕" w:cs="맑은 고딕" w:eastAsia="맑은 고딕" w:hAnsi="맑은 고딕"/>
+                <w:b w:val="false"/>
+                <w:bCs w:val="false"/>
+                <w:sz w:val="20"/>
+                <w:szCs w:val="20"/>
+              </w:rPr>
+              <w:t xml:space="preserve">10억원 이상 계약: 납품실적 5점 / 기술능력 10점 / 경영상태 30점 / 입찰가격 55점</w:t>
+            </w:r>
+          </w:p>
+        </w:tc>
+      </w:tr>
+    </w:tbl>
+    <w:p>
+      <w:pPr>
+        <w:spacing w:before="160"/>
+      </w:pPr>
+      <w:r>
+        <w:rPr>
+          <w:rFonts w:ascii="맑은 고딕" w:cs="맑은 고딕" w:eastAsia="맑은 고딕" w:hAnsi="맑은 고딕"/>
+          <w:color w:val="555555"/>
+          <w:sz w:val="19"/>
+          <w:szCs w:val="19"/>
+        </w:rPr>
+        <w:t xml:space="preserve">※ 위 내용은 요지이며, 정확한 문언은 고시 원문(법령정보센터 게재)을 따릅니다.</w:t>
       </w:r>
     </w:p>
     <w:sectPr>

</xml_diff>

<commit_message>
Remove score column from opinion letter table
Co-Authored-By: Claude Sonnet 5.5 <noreply@anthropic.com>
Claude-Session: https://claude.ai/code/session_01MdmrBNvqv8LepqLUPjtCN4
</commit_message>
<xml_diff>
--- a/의견서_초안.docx
+++ b/의견서_초안.docx
@@ -159,15 +159,14 @@
         </w:tblBorders>
       </w:tblPr>
       <w:tblGrid>
-        <w:gridCol w:w="2400"/>
-        <w:gridCol w:w="1800"/>
-        <w:gridCol w:w="3900"/>
-        <w:gridCol w:w="926"/>
+        <w:gridCol w:w="2600"/>
+        <w:gridCol w:w="2000"/>
+        <w:gridCol w:w="4426"/>
       </w:tblGrid>
       <w:tr>
         <w:tc>
           <w:tcPr>
-            <w:tcW w:type="dxa" w:w="2400"/>
+            <w:tcW w:type="dxa" w:w="2600"/>
             <w:tcBorders>
               <w:top w:val="single" w:color="808080" w:sz="4"/>
               <w:left w:val="single" w:color="808080" w:sz="4"/>
@@ -202,7 +201,7 @@
         </w:tc>
         <w:tc>
           <w:tcPr>
-            <w:tcW w:type="dxa" w:w="1800"/>
+            <w:tcW w:type="dxa" w:w="2000"/>
             <w:tcBorders>
               <w:top w:val="single" w:color="808080" w:sz="4"/>
               <w:left w:val="single" w:color="808080" w:sz="4"/>
@@ -237,7 +236,7 @@
         </w:tc>
         <w:tc>
           <w:tcPr>
-            <w:tcW w:type="dxa" w:w="3900"/>
+            <w:tcW w:type="dxa" w:w="4426"/>
             <w:tcBorders>
               <w:top w:val="single" w:color="808080" w:sz="4"/>
               <w:left w:val="single" w:color="808080" w:sz="4"/>
@@ -270,46 +269,11 @@
             </w:r>
           </w:p>
         </w:tc>
-        <w:tc>
-          <w:tcPr>
-            <w:tcW w:type="dxa" w:w="926"/>
-            <w:tcBorders>
-              <w:top w:val="single" w:color="808080" w:sz="4"/>
-              <w:left w:val="single" w:color="808080" w:sz="4"/>
-              <w:bottom w:val="single" w:color="808080" w:sz="4"/>
-              <w:right w:val="single" w:color="808080" w:sz="4"/>
-            </w:tcBorders>
-            <w:shd w:fill="D9E2F3" w:color="auto" w:val="clear"/>
-            <w:tcMar>
-              <w:top w:type="dxa" w:w="70"/>
-              <w:left w:type="dxa" w:w="100"/>
-              <w:bottom w:type="dxa" w:w="70"/>
-              <w:right w:type="dxa" w:w="100"/>
-            </w:tcMar>
-            <w:vAlign w:val="center"/>
-          </w:tcPr>
-          <w:p>
-            <w:pPr>
-              <w:spacing w:after="0"/>
-              <w:jc w:val="center"/>
-            </w:pPr>
-            <w:r>
-              <w:rPr>
-                <w:rFonts w:ascii="맑은 고딕" w:cs="맑은 고딕" w:eastAsia="맑은 고딕" w:hAnsi="맑은 고딕"/>
-                <w:b/>
-                <w:bCs/>
-                <w:sz w:val="20"/>
-                <w:szCs w:val="20"/>
-              </w:rPr>
-              <w:t xml:space="preserve">배점</w:t>
-            </w:r>
-          </w:p>
-        </w:tc>
       </w:tr>
       <w:tr>
         <w:tc>
           <w:tcPr>
-            <w:tcW w:type="dxa" w:w="2400"/>
+            <w:tcW w:type="dxa" w:w="2600"/>
             <w:tcBorders>
               <w:top w:val="single" w:color="808080" w:sz="4"/>
               <w:left w:val="single" w:color="808080" w:sz="4"/>
@@ -343,7 +307,7 @@
         </w:tc>
         <w:tc>
           <w:tcPr>
-            <w:tcW w:type="dxa" w:w="1800"/>
+            <w:tcW w:type="dxa" w:w="2000"/>
             <w:tcBorders>
               <w:top w:val="single" w:color="808080" w:sz="4"/>
               <w:left w:val="single" w:color="808080" w:sz="4"/>
@@ -377,7 +341,7 @@
         </w:tc>
         <w:tc>
           <w:tcPr>
-            <w:tcW w:type="dxa" w:w="3900"/>
+            <w:tcW w:type="dxa" w:w="4426"/>
             <w:tcBorders>
               <w:top w:val="single" w:color="808080" w:sz="4"/>
               <w:left w:val="single" w:color="808080" w:sz="4"/>
@@ -406,40 +370,6 @@
                 <w:szCs w:val="20"/>
               </w:rPr>
               <w:t xml:space="preserve">대당 개폐용량 70톤 이상이며, 와이어로프식 수문권양기</w:t>
-            </w:r>
-          </w:p>
-        </w:tc>
-        <w:tc>
-          <w:tcPr>
-            <w:tcW w:type="dxa" w:w="926"/>
-            <w:tcBorders>
-              <w:top w:val="single" w:color="808080" w:sz="4"/>
-              <w:left w:val="single" w:color="808080" w:sz="4"/>
-              <w:bottom w:val="single" w:color="808080" w:sz="4"/>
-              <w:right w:val="single" w:color="808080" w:sz="4"/>
-            </w:tcBorders>
-            <w:tcMar>
-              <w:top w:type="dxa" w:w="70"/>
-              <w:left w:type="dxa" w:w="100"/>
-              <w:bottom w:type="dxa" w:w="70"/>
-              <w:right w:type="dxa" w:w="100"/>
-            </w:tcMar>
-            <w:vAlign w:val="center"/>
-          </w:tcPr>
-          <w:p>
-            <w:pPr>
-              <w:spacing w:after="0"/>
-              <w:jc w:val="center"/>
-            </w:pPr>
-            <w:r>
-              <w:rPr>
-                <w:rFonts w:ascii="맑은 고딕" w:cs="맑은 고딕" w:eastAsia="맑은 고딕" w:hAnsi="맑은 고딕"/>
-                <w:b w:val="false"/>
-                <w:bCs w:val="false"/>
-                <w:sz w:val="20"/>
-                <w:szCs w:val="20"/>
-              </w:rPr>
-              <w:t xml:space="preserve">5.0</w:t>
             </w:r>
           </w:p>
         </w:tc>
@@ -447,7 +377,7 @@
       <w:tr>
         <w:tc>
           <w:tcPr>
-            <w:tcW w:type="dxa" w:w="2400"/>
+            <w:tcW w:type="dxa" w:w="2600"/>
             <w:tcBorders>
               <w:top w:val="single" w:color="808080" w:sz="4"/>
               <w:left w:val="single" w:color="808080" w:sz="4"/>
@@ -481,7 +411,7 @@
         </w:tc>
         <w:tc>
           <w:tcPr>
-            <w:tcW w:type="dxa" w:w="1800"/>
+            <w:tcW w:type="dxa" w:w="2000"/>
             <w:tcBorders>
               <w:top w:val="single" w:color="808080" w:sz="4"/>
               <w:left w:val="single" w:color="808080" w:sz="4"/>
@@ -515,7 +445,7 @@
         </w:tc>
         <w:tc>
           <w:tcPr>
-            <w:tcW w:type="dxa" w:w="3900"/>
+            <w:tcW w:type="dxa" w:w="4426"/>
             <w:tcBorders>
               <w:top w:val="single" w:color="808080" w:sz="4"/>
               <w:left w:val="single" w:color="808080" w:sz="4"/>
@@ -544,40 +474,6 @@
                 <w:szCs w:val="20"/>
               </w:rPr>
               <w:t xml:space="preserve">대당 개폐용량 70톤 미만인 수문권양기(와이어로프식, 유압식, 랙피니언식 등)</w:t>
-            </w:r>
-          </w:p>
-        </w:tc>
-        <w:tc>
-          <w:tcPr>
-            <w:tcW w:type="dxa" w:w="926"/>
-            <w:tcBorders>
-              <w:top w:val="single" w:color="808080" w:sz="4"/>
-              <w:left w:val="single" w:color="808080" w:sz="4"/>
-              <w:bottom w:val="single" w:color="808080" w:sz="4"/>
-              <w:right w:val="single" w:color="808080" w:sz="4"/>
-            </w:tcBorders>
-            <w:tcMar>
-              <w:top w:type="dxa" w:w="70"/>
-              <w:left w:type="dxa" w:w="100"/>
-              <w:bottom w:type="dxa" w:w="70"/>
-              <w:right w:type="dxa" w:w="100"/>
-            </w:tcMar>
-            <w:vAlign w:val="center"/>
-          </w:tcPr>
-          <w:p>
-            <w:pPr>
-              <w:spacing w:after="0"/>
-              <w:jc w:val="center"/>
-            </w:pPr>
-            <w:r>
-              <w:rPr>
-                <w:rFonts w:ascii="맑은 고딕" w:cs="맑은 고딕" w:eastAsia="맑은 고딕" w:hAnsi="맑은 고딕"/>
-                <w:b w:val="false"/>
-                <w:bCs w:val="false"/>
-                <w:sz w:val="20"/>
-                <w:szCs w:val="20"/>
-              </w:rPr>
-              <w:t xml:space="preserve">1.5</w:t>
             </w:r>
           </w:p>
         </w:tc>

</xml_diff>

<commit_message>
Remove scores from attachments of opinion letter
Co-Authored-By: Claude Sonnet 5.5 <noreply@anthropic.com>
Claude-Session: https://claude.ai/code/session_01MdmrBNvqv8LepqLUPjtCN4
</commit_message>
<xml_diff>
--- a/의견서_초안.docx
+++ b/의견서_초안.docx
@@ -786,7 +786,7 @@
                 <w:sz w:val="20"/>
                 <w:szCs w:val="20"/>
               </w:rPr>
-              <w:t xml:space="preserve">동등이상 물품 (5.0점)</w:t>
+              <w:t xml:space="preserve">동등이상 물품</w:t>
             </w:r>
           </w:p>
         </w:tc>
@@ -890,7 +890,7 @@
                 <w:sz w:val="20"/>
                 <w:szCs w:val="20"/>
               </w:rPr>
-              <w:t xml:space="preserve">유사물품 (1.5점)</w:t>
+              <w:t xml:space="preserve">유사물품</w:t>
             </w:r>
           </w:p>
         </w:tc>
@@ -1497,76 +1497,6 @@
                 <w:szCs w:val="20"/>
               </w:rPr>
               <w:t xml:space="preserve">동등이상 물품은 성능·품질이 입찰대상 물품 이상인 것, 유사물품은 동일 종류로서 성능·품질이 동등 미만인 것</w:t>
-            </w:r>
-          </w:p>
-        </w:tc>
-      </w:tr>
-      <w:tr>
-        <w:tc>
-          <w:tcPr>
-            <w:tcW w:type="dxa" w:w="2300"/>
-            <w:tcBorders>
-              <w:top w:val="single" w:color="808080" w:sz="4"/>
-              <w:left w:val="single" w:color="808080" w:sz="4"/>
-              <w:bottom w:val="single" w:color="808080" w:sz="4"/>
-              <w:right w:val="single" w:color="808080" w:sz="4"/>
-            </w:tcBorders>
-            <w:tcMar>
-              <w:top w:type="dxa" w:w="70"/>
-              <w:left w:type="dxa" w:w="100"/>
-              <w:bottom w:type="dxa" w:w="70"/>
-              <w:right w:type="dxa" w:w="100"/>
-            </w:tcMar>
-            <w:vAlign w:val="center"/>
-          </w:tcPr>
-          <w:p>
-            <w:pPr>
-              <w:spacing w:after="0"/>
-              <w:jc w:val="center"/>
-            </w:pPr>
-            <w:r>
-              <w:rPr>
-                <w:rFonts w:ascii="맑은 고딕" w:cs="맑은 고딕" w:eastAsia="맑은 고딕" w:hAnsi="맑은 고딕"/>
-                <w:b w:val="false"/>
-                <w:bCs w:val="false"/>
-                <w:sz w:val="20"/>
-                <w:szCs w:val="20"/>
-              </w:rPr>
-              <w:t xml:space="preserve">같은 고시 [별표 1] 배점</w:t>
-            </w:r>
-          </w:p>
-        </w:tc>
-        <w:tc>
-          <w:tcPr>
-            <w:tcW w:type="dxa" w:w="6726"/>
-            <w:tcBorders>
-              <w:top w:val="single" w:color="808080" w:sz="4"/>
-              <w:left w:val="single" w:color="808080" w:sz="4"/>
-              <w:bottom w:val="single" w:color="808080" w:sz="4"/>
-              <w:right w:val="single" w:color="808080" w:sz="4"/>
-            </w:tcBorders>
-            <w:tcMar>
-              <w:top w:type="dxa" w:w="70"/>
-              <w:left w:type="dxa" w:w="100"/>
-              <w:bottom w:type="dxa" w:w="70"/>
-              <w:right w:type="dxa" w:w="100"/>
-            </w:tcMar>
-            <w:vAlign w:val="center"/>
-          </w:tcPr>
-          <w:p>
-            <w:pPr>
-              <w:spacing w:after="0"/>
-              <w:jc w:val="left"/>
-            </w:pPr>
-            <w:r>
-              <w:rPr>
-                <w:rFonts w:ascii="맑은 고딕" w:cs="맑은 고딕" w:eastAsia="맑은 고딕" w:hAnsi="맑은 고딕"/>
-                <w:b w:val="false"/>
-                <w:bCs w:val="false"/>
-                <w:sz w:val="20"/>
-                <w:szCs w:val="20"/>
-              </w:rPr>
-              <w:t xml:space="preserve">10억원 이상 계약: 납품실적 5점 / 기술능력 10점 / 경영상태 30점 / 입찰가격 55점</w:t>
             </w:r>
           </w:p>
         </w:tc>

</xml_diff>

<commit_message>
Emphasize plan 1 column in comparison table
Co-Authored-By: Claude Sonnet 5.5 <noreply@anthropic.com>
Claude-Session: https://claude.ai/code/session_01MdmrBNvqv8LepqLUPjtCN4
</commit_message>
<xml_diff>
--- a/의견서_초안.docx
+++ b/의견서_초안.docx
@@ -688,10 +688,10 @@
           <w:tcPr>
             <w:tcW w:type="dxa" w:w="3663"/>
             <w:tcBorders>
-              <w:top w:val="single" w:color="808080" w:sz="4"/>
-              <w:left w:val="single" w:color="808080" w:sz="4"/>
-              <w:bottom w:val="single" w:color="808080" w:sz="4"/>
-              <w:right w:val="single" w:color="808080" w:sz="4"/>
+              <w:top w:val="single" w:color="000000" w:sz="24"/>
+              <w:left w:val="single" w:color="000000" w:sz="24"/>
+              <w:bottom w:val="single" w:color="808080" w:sz="4"/>
+              <w:right w:val="single" w:color="000000" w:sz="24"/>
             </w:tcBorders>
             <w:shd w:fill="D9E2F3" w:color="auto" w:val="clear"/>
             <w:tcMar>
@@ -795,9 +795,9 @@
             <w:tcW w:type="dxa" w:w="3663"/>
             <w:tcBorders>
               <w:top w:val="single" w:color="808080" w:sz="4"/>
-              <w:left w:val="single" w:color="808080" w:sz="4"/>
-              <w:bottom w:val="single" w:color="808080" w:sz="4"/>
-              <w:right w:val="single" w:color="808080" w:sz="4"/>
+              <w:left w:val="single" w:color="000000" w:sz="24"/>
+              <w:bottom w:val="single" w:color="808080" w:sz="4"/>
+              <w:right w:val="single" w:color="000000" w:sz="24"/>
             </w:tcBorders>
             <w:tcMar>
               <w:top w:type="dxa" w:w="70"/>
@@ -815,8 +815,8 @@
             <w:r>
               <w:rPr>
                 <w:rFonts w:ascii="맑은 고딕" w:cs="맑은 고딕" w:eastAsia="맑은 고딕" w:hAnsi="맑은 고딕"/>
-                <w:b w:val="false"/>
-                <w:bCs w:val="false"/>
+                <w:b/>
+                <w:bCs/>
                 <w:sz w:val="20"/>
                 <w:szCs w:val="20"/>
               </w:rPr>
@@ -899,9 +899,9 @@
             <w:tcW w:type="dxa" w:w="3663"/>
             <w:tcBorders>
               <w:top w:val="single" w:color="808080" w:sz="4"/>
-              <w:left w:val="single" w:color="808080" w:sz="4"/>
-              <w:bottom w:val="single" w:color="808080" w:sz="4"/>
-              <w:right w:val="single" w:color="808080" w:sz="4"/>
+              <w:left w:val="single" w:color="000000" w:sz="24"/>
+              <w:bottom w:val="single" w:color="808080" w:sz="4"/>
+              <w:right w:val="single" w:color="000000" w:sz="24"/>
             </w:tcBorders>
             <w:tcMar>
               <w:top w:type="dxa" w:w="70"/>
@@ -919,8 +919,8 @@
             <w:r>
               <w:rPr>
                 <w:rFonts w:ascii="맑은 고딕" w:cs="맑은 고딕" w:eastAsia="맑은 고딕" w:hAnsi="맑은 고딕"/>
-                <w:b w:val="false"/>
-                <w:bCs w:val="false"/>
+                <w:b/>
+                <w:bCs/>
                 <w:sz w:val="20"/>
                 <w:szCs w:val="20"/>
               </w:rPr>
@@ -1003,9 +1003,9 @@
             <w:tcW w:type="dxa" w:w="3663"/>
             <w:tcBorders>
               <w:top w:val="single" w:color="808080" w:sz="4"/>
-              <w:left w:val="single" w:color="808080" w:sz="4"/>
-              <w:bottom w:val="single" w:color="808080" w:sz="4"/>
-              <w:right w:val="single" w:color="808080" w:sz="4"/>
+              <w:left w:val="single" w:color="000000" w:sz="24"/>
+              <w:bottom w:val="single" w:color="808080" w:sz="4"/>
+              <w:right w:val="single" w:color="000000" w:sz="24"/>
             </w:tcBorders>
             <w:tcMar>
               <w:top w:type="dxa" w:w="70"/>
@@ -1023,8 +1023,8 @@
             <w:r>
               <w:rPr>
                 <w:rFonts w:ascii="맑은 고딕" w:cs="맑은 고딕" w:eastAsia="맑은 고딕" w:hAnsi="맑은 고딕"/>
-                <w:b w:val="false"/>
-                <w:bCs w:val="false"/>
+                <w:b/>
+                <w:bCs/>
                 <w:sz w:val="20"/>
                 <w:szCs w:val="20"/>
               </w:rPr>
@@ -1107,9 +1107,9 @@
             <w:tcW w:type="dxa" w:w="3663"/>
             <w:tcBorders>
               <w:top w:val="single" w:color="808080" w:sz="4"/>
-              <w:left w:val="single" w:color="808080" w:sz="4"/>
-              <w:bottom w:val="single" w:color="808080" w:sz="4"/>
-              <w:right w:val="single" w:color="808080" w:sz="4"/>
+              <w:left w:val="single" w:color="000000" w:sz="24"/>
+              <w:bottom w:val="single" w:color="000000" w:sz="24"/>
+              <w:right w:val="single" w:color="000000" w:sz="24"/>
             </w:tcBorders>
             <w:tcMar>
               <w:top w:type="dxa" w:w="70"/>
@@ -1127,8 +1127,8 @@
             <w:r>
               <w:rPr>
                 <w:rFonts w:ascii="맑은 고딕" w:cs="맑은 고딕" w:eastAsia="맑은 고딕" w:hAnsi="맑은 고딕"/>
-                <w:b w:val="false"/>
-                <w:bCs w:val="false"/>
+                <w:b/>
+                <w:bCs/>
                 <w:sz w:val="20"/>
                 <w:szCs w:val="20"/>
               </w:rPr>

</xml_diff>